<commit_message>
completed data encoding and added GF(256) values
</commit_message>
<xml_diff>
--- a/documentation.docx
+++ b/documentation.docx
@@ -721,7 +721,14 @@
           <w:sz w:val="36"/>
           <w:szCs w:val="36"/>
         </w:rPr>
-        <w:t>Of bit string length after adding terminator bits is not a multiple of 8 add 0s to the right to complete the byte</w:t>
+        <w:t>I</w:t>
+      </w:r>
+      <w:r>
+        <w:rPr>
+          <w:sz w:val="36"/>
+          <w:szCs w:val="36"/>
+        </w:rPr>
+        <w:t>f bit string length after adding terminator bits is not a multiple of 8 add 0s to the right to complete the byte</w:t>
       </w:r>
     </w:p>
     <w:p>
@@ -5659,23 +5666,7 @@
             <w:sz w:val="36"/>
             <w:szCs w:val="36"/>
           </w:rPr>
-          <w:t>QR Code Tutoria</w:t>
-        </w:r>
-        <w:r>
-          <w:rPr>
-            <w:rStyle w:val="Hyperlink"/>
-            <w:sz w:val="36"/>
-            <w:szCs w:val="36"/>
-          </w:rPr>
-          <w:t>l</w:t>
-        </w:r>
-        <w:r>
-          <w:rPr>
-            <w:rStyle w:val="Hyperlink"/>
-            <w:sz w:val="36"/>
-            <w:szCs w:val="36"/>
-          </w:rPr>
-          <w:t xml:space="preserve"> - </w:t>
+          <w:t xml:space="preserve">QR Code Tutorial - </w:t>
         </w:r>
         <w:proofErr w:type="spellStart"/>
         <w:r>
@@ -6642,6 +6633,7 @@
   <w:style w:type="character" w:default="1" w:styleId="DefaultParagraphFont">
     <w:name w:val="Default Paragraph Font"/>
     <w:uiPriority w:val="1"/>
+    <w:semiHidden/>
     <w:unhideWhenUsed/>
   </w:style>
   <w:style w:type="table" w:default="1" w:styleId="TableNormal">

</xml_diff>